<commit_message>
Add new draft version of the research report for hyperspectral analysis
</commit_message>
<xml_diff>
--- a/Research_Report_Hyperspectral_Forest.docx
+++ b/Research_Report_Hyperspectral_Forest.docx
@@ -197,8 +197,13 @@
       <w:pPr>
         <w:pStyle w:val="Heading2"/>
       </w:pPr>
-      <w:r>
-        <w:t>2.1  FREEDLES Airborne Dataset</w:t>
+      <w:proofErr w:type="gramStart"/>
+      <w:r>
+        <w:t>2.1  FREEDLES</w:t>
+      </w:r>
+      <w:proofErr w:type="gramEnd"/>
+      <w:r>
+        <w:t xml:space="preserve"> Airborne Dataset</w:t>
       </w:r>
     </w:p>
     <w:p>
@@ -403,7 +408,21 @@
               <w:rPr>
                 <w:sz w:val="19"/>
               </w:rPr>
-              <w:t>Scots pine, Norway spruce, Silver birch</w:t>
+              <w:t xml:space="preserve">Scots pine, Norway spruce, </w:t>
+            </w:r>
+            <w:proofErr w:type="gramStart"/>
+            <w:r>
+              <w:rPr>
+                <w:sz w:val="19"/>
+              </w:rPr>
+              <w:t>Silver</w:t>
+            </w:r>
+            <w:proofErr w:type="gramEnd"/>
+            <w:r>
+              <w:rPr>
+                <w:sz w:val="19"/>
+              </w:rPr>
+              <w:t xml:space="preserve"> birch</w:t>
             </w:r>
           </w:p>
         </w:tc>
@@ -493,7 +512,21 @@
               <w:rPr>
                 <w:sz w:val="19"/>
               </w:rPr>
-              <w:t>Scots pine, Norway spruce, Silver birch, Alder</w:t>
+              <w:t xml:space="preserve">Scots pine, Norway spruce, </w:t>
+            </w:r>
+            <w:proofErr w:type="gramStart"/>
+            <w:r>
+              <w:rPr>
+                <w:sz w:val="19"/>
+              </w:rPr>
+              <w:t>Silver</w:t>
+            </w:r>
+            <w:proofErr w:type="gramEnd"/>
+            <w:r>
+              <w:rPr>
+                <w:sz w:val="19"/>
+              </w:rPr>
+              <w:t xml:space="preserve"> birch, Alder</w:t>
             </w:r>
           </w:p>
         </w:tc>
@@ -693,9 +726,11 @@
       <w:pPr>
         <w:pStyle w:val="Heading2"/>
       </w:pPr>
+      <w:proofErr w:type="gramStart"/>
       <w:r>
         <w:t>2.2  Sensors</w:t>
       </w:r>
+      <w:proofErr w:type="gramEnd"/>
     </w:p>
     <w:p>
       <w:pPr>
@@ -717,8 +752,13 @@
       <w:pPr>
         <w:pStyle w:val="Heading2"/>
       </w:pPr>
-      <w:r>
-        <w:t>2.3  BilyKriz Field Spectroscopy Dataset</w:t>
+      <w:proofErr w:type="gramStart"/>
+      <w:r>
+        <w:t>2.3  BilyKriz</w:t>
+      </w:r>
+      <w:proofErr w:type="gramEnd"/>
+      <w:r>
+        <w:t xml:space="preserve"> Field Spectroscopy Dataset</w:t>
       </w:r>
     </w:p>
     <w:p>
@@ -726,7 +766,15 @@
         <w:jc w:val="both"/>
       </w:pPr>
       <w:r>
-        <w:t xml:space="preserve">A supplementary dataset (DatasetOfTreeCanopyStructure...V2.xlsx) provides 465 field-measured canopy reflectance spectra at 350–2500 nm (1 nm step, approximately ASD FieldSpec resolution) for 31 stands across Järvselja (13), Bílý Kríž (8), and Lanzhot (10). Each stand has 15 positional measurements taken within the stand polygon. Bílý Kríž contributes BK_Spruce1–8, one additional stand (Spruce8) beyond the 7 stands present in the airborne tile dataset. Forest type was assigned from species basal-area percentages: stands with &gt;70% coniferous basal area were labelled </w:t>
+        <w:t xml:space="preserve">A supplementary dataset (DatasetOfTreeCanopyStructure...V2.xlsx) provides 465 field-measured canopy reflectance spectra at 350–2500 nm (1 nm step, approximately ASD FieldSpec resolution) for 31 stands across Järvselja (13), Bílý Kríž (8), and Lanzhot (10). Each stand has 15 positional measurements taken within the stand polygon. Bílý Kríž contributes BK_Spruce1–8, one additional stand (Spruce8) beyond the 7 stands present in the airborne tile dataset. Forest type was assigned from species </w:t>
+      </w:r>
+      <w:proofErr w:type="gramStart"/>
+      <w:r>
+        <w:t>basal-area</w:t>
+      </w:r>
+      <w:proofErr w:type="gramEnd"/>
+      <w:r>
+        <w:t xml:space="preserve"> percentages: stands with &gt;70% coniferous basal area were labelled </w:t>
       </w:r>
       <w:r>
         <w:lastRenderedPageBreak/>
@@ -819,15 +867,28 @@
         <w:jc w:val="both"/>
       </w:pPr>
       <w:r>
-        <w:t>This formulation embeds an explicit spatial generalisation constraint: training and test data come from geographically and climatically distinct regions. This is in contrast to the random train/test split common in machine learning, which would allow spatial autocorrelation to leak information from training to test sets and produce optimistically biased performance estimates (Roberts et al. 2017; Ploton et al. 2020).</w:t>
+        <w:t xml:space="preserve">This formulation embeds an explicit spatial generalisation constraint: training and test data come from geographically and climatically distinct regions. This </w:t>
+      </w:r>
+      <w:proofErr w:type="gramStart"/>
+      <w:r>
+        <w:t>is in contrast to</w:t>
+      </w:r>
+      <w:proofErr w:type="gramEnd"/>
+      <w:r>
+        <w:t xml:space="preserve"> the random train/test split common in machine learning, which would allow spatial autocorrelation to leak information from training to test sets and produce optimistically biased performance estimates (Roberts et al. 2017; Ploton et al. 2020).</w:t>
       </w:r>
     </w:p>
     <w:p>
       <w:pPr>
         <w:pStyle w:val="Heading2"/>
       </w:pPr>
-      <w:r>
-        <w:t>3.1  Leave-One-Site-Out Cross-Validation</w:t>
+      <w:proofErr w:type="gramStart"/>
+      <w:r>
+        <w:t>3.1  Leave</w:t>
+      </w:r>
+      <w:proofErr w:type="gramEnd"/>
+      <w:r>
+        <w:t>-One-Site-Out Cross-Validation</w:t>
       </w:r>
     </w:p>
     <w:p>
@@ -848,8 +909,13 @@
       <w:pPr>
         <w:pStyle w:val="Heading2"/>
       </w:pPr>
-      <w:r>
-        <w:t>3.2  Primary Metric: Balanced Accuracy</w:t>
+      <w:proofErr w:type="gramStart"/>
+      <w:r>
+        <w:t>3.2  Primary</w:t>
+      </w:r>
+      <w:proofErr w:type="gramEnd"/>
+      <w:r>
+        <w:t xml:space="preserve"> Metric: Balanced Accuracy</w:t>
       </w:r>
     </w:p>
     <w:p>
@@ -857,15 +923,28 @@
         <w:jc w:val="both"/>
       </w:pPr>
       <w:r>
-        <w:t>Balanced accuracy (BA) is the arithmetic mean of per-class recall. It is the appropriate primary metric here because the class distribution is strongly imbalanced (33 coniferous : 15 broadleaved : 10 mixed). Overall accuracy would be dominated by the majority class and would not reflect the classifier's ability to identify the rarer broadleaved and mixed classes. Secondary metrics include macro-F1 (unweighted average F1), overall accuracy, and Cohen's κ.</w:t>
+        <w:t xml:space="preserve">Balanced accuracy (BA) is the arithmetic mean of per-class recall. It is the appropriate primary metric here because the class distribution is strongly imbalanced (33 </w:t>
+      </w:r>
+      <w:proofErr w:type="gramStart"/>
+      <w:r>
+        <w:t>coniferous :</w:t>
+      </w:r>
+      <w:proofErr w:type="gramEnd"/>
+      <w:r>
+        <w:t xml:space="preserve"> 15 broadleaved : 10 mixed). Overall accuracy would be dominated by the majority class and would not reflect the classifier's ability to identify the rarer broadleaved and mixed classes. Secondary metrics include macro-F1 (unweighted average F1), overall accuracy, and Cohen's κ.</w:t>
       </w:r>
     </w:p>
     <w:p>
       <w:pPr>
         <w:pStyle w:val="Heading2"/>
       </w:pPr>
-      <w:r>
-        <w:t>3.3  Binary Sub-Problem</w:t>
+      <w:proofErr w:type="gramStart"/>
+      <w:r>
+        <w:t>3.3  Binary</w:t>
+      </w:r>
+      <w:proofErr w:type="gramEnd"/>
+      <w:r>
+        <w:t xml:space="preserve"> Sub-Problem</w:t>
       </w:r>
     </w:p>
     <w:p>
@@ -894,8 +973,13 @@
       <w:pPr>
         <w:pStyle w:val="Heading2"/>
       </w:pPr>
-      <w:r>
-        <w:t>4.1  Data Discovery</w:t>
+      <w:proofErr w:type="gramStart"/>
+      <w:r>
+        <w:t>4.1  Data</w:t>
+      </w:r>
+      <w:proofErr w:type="gramEnd"/>
+      <w:r>
+        <w:t xml:space="preserve"> Discovery</w:t>
       </w:r>
     </w:p>
     <w:p>
@@ -1019,8 +1103,13 @@
       <w:pPr>
         <w:pStyle w:val="Heading2"/>
       </w:pPr>
-      <w:r>
-        <w:t>4.2  Class and Site Distribution</w:t>
+      <w:proofErr w:type="gramStart"/>
+      <w:r>
+        <w:t>4.2  Class</w:t>
+      </w:r>
+      <w:proofErr w:type="gramEnd"/>
+      <w:r>
+        <w:t xml:space="preserve"> and Site Distribution</w:t>
       </w:r>
     </w:p>
     <w:p>
@@ -1041,8 +1130,13 @@
       <w:pPr>
         <w:pStyle w:val="Heading2"/>
       </w:pPr>
-      <w:r>
-        <w:t>4.3  Spectral Characteristics</w:t>
+      <w:proofErr w:type="gramStart"/>
+      <w:r>
+        <w:t>4.3  Spectral</w:t>
+      </w:r>
+      <w:proofErr w:type="gramEnd"/>
+      <w:r>
+        <w:t xml:space="preserve"> Characteristics</w:t>
       </w:r>
     </w:p>
     <w:p>
@@ -1139,8 +1233,13 @@
       <w:pPr>
         <w:pStyle w:val="Heading2"/>
       </w:pPr>
-      <w:r>
-        <w:t>5.1  Feature Extraction</w:t>
+      <w:proofErr w:type="gramStart"/>
+      <w:r>
+        <w:t>5.1  Feature</w:t>
+      </w:r>
+      <w:proofErr w:type="gramEnd"/>
+      <w:r>
+        <w:t xml:space="preserve"> Extraction</w:t>
       </w:r>
     </w:p>
     <w:p>
@@ -1222,9 +1321,11 @@
       <w:pPr>
         <w:pStyle w:val="Heading2"/>
       </w:pPr>
+      <w:proofErr w:type="gramStart"/>
       <w:r>
         <w:t>5.2  Preprocessing</w:t>
       </w:r>
+      <w:proofErr w:type="gramEnd"/>
     </w:p>
     <w:p>
       <w:pPr>
@@ -1246,9 +1347,11 @@
       <w:pPr>
         <w:pStyle w:val="Heading2"/>
       </w:pPr>
+      <w:proofErr w:type="gramStart"/>
       <w:r>
         <w:t>5.3  Classifiers</w:t>
       </w:r>
+      <w:proofErr w:type="gramEnd"/>
     </w:p>
     <w:tbl>
       <w:tblPr>
@@ -1616,8 +1719,13 @@
       <w:pPr>
         <w:pStyle w:val="Heading2"/>
       </w:pPr>
-      <w:r>
-        <w:t>5.4  Ablation Experiments</w:t>
+      <w:proofErr w:type="gramStart"/>
+      <w:r>
+        <w:t>5.4  Ablation</w:t>
+      </w:r>
+      <w:proofErr w:type="gramEnd"/>
+      <w:r>
+        <w:t xml:space="preserve"> Experiments</w:t>
       </w:r>
     </w:p>
     <w:p>
@@ -1651,7 +1759,21 @@
         <w:rPr>
           <w:sz w:val="21"/>
         </w:rPr>
-        <w:t>A2 — Binary problem: drop mixed-class stands. Isolates whether the conifer/broadleaf distinction is biome-stable.</w:t>
+        <w:t xml:space="preserve">A2 — Binary problem: drop mixed-class stands. Isolates whether the conifer/broadleaf distinction is </w:t>
+      </w:r>
+      <w:proofErr w:type="gramStart"/>
+      <w:r>
+        <w:rPr>
+          <w:sz w:val="21"/>
+        </w:rPr>
+        <w:t>biome-stable</w:t>
+      </w:r>
+      <w:proofErr w:type="gramEnd"/>
+      <w:r>
+        <w:rPr>
+          <w:sz w:val="21"/>
+        </w:rPr>
+        <w:t>.</w:t>
       </w:r>
     </w:p>
     <w:p>
@@ -1732,8 +1854,13 @@
       <w:pPr>
         <w:pStyle w:val="Heading2"/>
       </w:pPr>
-      <w:r>
-        <w:t>6.1  Pipeline Construction Failures</w:t>
+      <w:proofErr w:type="gramStart"/>
+      <w:r>
+        <w:t>6.1  Pipeline</w:t>
+      </w:r>
+      <w:proofErr w:type="gramEnd"/>
+      <w:r>
+        <w:t xml:space="preserve"> Construction Failures</w:t>
       </w:r>
     </w:p>
     <w:p>
@@ -1847,7 +1974,35 @@
         <w:rPr>
           <w:sz w:val="21"/>
         </w:rPr>
-        <w:t>The loader logged 'No wavelength metadata found; using band indices 0..47'. The water-vapour exclusion compared band wavelengths (in nm) to exclusion ranges (in nm). With band indices [0,1,...,47], all comparisons like 'is 5 in [895,1003]' returned False — so all 48 bands were retained and the exclusion was silently skipped.</w:t>
+        <w:t xml:space="preserve">The loader logged 'No wavelength metadata found; using band indices </w:t>
+      </w:r>
+      <w:proofErr w:type="gramStart"/>
+      <w:r>
+        <w:rPr>
+          <w:sz w:val="21"/>
+        </w:rPr>
+        <w:t>0..</w:t>
+      </w:r>
+      <w:proofErr w:type="gramEnd"/>
+      <w:r>
+        <w:rPr>
+          <w:sz w:val="21"/>
+        </w:rPr>
+        <w:t>47'. The water-vapour exclusion compared band wavelengths (in nm) to exclusion ranges (in nm). With band indices [</w:t>
+      </w:r>
+      <w:proofErr w:type="gramStart"/>
+      <w:r>
+        <w:rPr>
+          <w:sz w:val="21"/>
+        </w:rPr>
+        <w:t>0,1,...</w:t>
+      </w:r>
+      <w:proofErr w:type="gramEnd"/>
+      <w:r>
+        <w:rPr>
+          <w:sz w:val="21"/>
+        </w:rPr>
+        <w:t>,47], all comparisons like 'is 5 in [895,1003]' returned False — so all 48 bands were retained and the exclusion was silently skipped.</w:t>
       </w:r>
     </w:p>
     <w:p>
@@ -1865,7 +2020,21 @@
         <w:rPr>
           <w:sz w:val="21"/>
         </w:rPr>
-        <w:t>Extracted 48 CASI centre wavelengths from ENVI flight-line headers (.hdr files). Added them to config/default.yaml under casi_wavelengths_nm. In runner.py, detected whether tile wavelengths were band indices (by comparing to np.arange(n_bands)) and injected the config wavelengths when so.</w:t>
+        <w:t xml:space="preserve">Extracted 48 CASI centre wavelengths from ENVI flight-line headers (.hdr files). Added them to config/default.yaml under casi_wavelengths_nm. In runner.py, detected whether tile wavelengths were band indices (by comparing to </w:t>
+      </w:r>
+      <w:proofErr w:type="gramStart"/>
+      <w:r>
+        <w:rPr>
+          <w:sz w:val="21"/>
+        </w:rPr>
+        <w:t>np.arange</w:t>
+      </w:r>
+      <w:proofErr w:type="gramEnd"/>
+      <w:r>
+        <w:rPr>
+          <w:sz w:val="21"/>
+        </w:rPr>
+        <w:t>(n_bands)) and injected the config wavelengths when so.</w:t>
       </w:r>
     </w:p>
     <w:p>
@@ -1909,7 +2078,21 @@
         <w:rPr>
           <w:sz w:val="21"/>
         </w:rPr>
-        <w:t>Set reflectance_scale_factor: 10000 in config. Added a division step in runner.py after tile loading: tile.image = tile.image / scale.</w:t>
+        <w:t xml:space="preserve">Set reflectance_scale_factor: 10000 in config. Added a division step in runner.py after tile loading: </w:t>
+      </w:r>
+      <w:proofErr w:type="gramStart"/>
+      <w:r>
+        <w:rPr>
+          <w:sz w:val="21"/>
+        </w:rPr>
+        <w:t>tile.image</w:t>
+      </w:r>
+      <w:proofErr w:type="gramEnd"/>
+      <w:r>
+        <w:rPr>
+          <w:sz w:val="21"/>
+        </w:rPr>
+        <w:t xml:space="preserve"> = tile.image / scale.</w:t>
       </w:r>
     </w:p>
     <w:p>
@@ -1935,7 +2118,21 @@
         <w:rPr>
           <w:sz w:val="21"/>
         </w:rPr>
-        <w:t>The config specified nodata_value: 0, but rasterio confirmed src.nodata = 10000 in all tiles. With nodata=0, the masking step treated all pixels with DN=0 as nodata (a small fraction) but let the true nodata pixels (DN=10000) through as valid reflectance. Post-scaling these became 1.0 reflectance — a physically plausible but incorrect value that corrupted stand means near tile edges.</w:t>
+        <w:t xml:space="preserve">The config specified nodata_value: 0, but rasterio confirmed </w:t>
+      </w:r>
+      <w:proofErr w:type="gramStart"/>
+      <w:r>
+        <w:rPr>
+          <w:sz w:val="21"/>
+        </w:rPr>
+        <w:t>src.nodata</w:t>
+      </w:r>
+      <w:proofErr w:type="gramEnd"/>
+      <w:r>
+        <w:rPr>
+          <w:sz w:val="21"/>
+        </w:rPr>
+        <w:t xml:space="preserve"> = 10000 in all tiles. With nodata=0, the masking step treated all pixels with DN=0 as nodata (a small fraction) but let the true nodata pixels (DN=10000) through as valid reflectance. Post-scaling these became 1.0 reflectance — a physically plausible but incorrect value that corrupted stand means near tile edges.</w:t>
       </w:r>
     </w:p>
     <w:p>
@@ -1998,7 +2195,21 @@
         <w:rPr>
           <w:sz w:val="21"/>
         </w:rPr>
-        <w:t>Added labels=class_names to both confusion_matrix() and classification_report() calls. This forces the functions to use all three class labels even when only one is present in y_true, producing zero-filled rows/columns for absent classes.</w:t>
+        <w:t>Added labels=class_names to both confusion_</w:t>
+      </w:r>
+      <w:proofErr w:type="gramStart"/>
+      <w:r>
+        <w:rPr>
+          <w:sz w:val="21"/>
+        </w:rPr>
+        <w:t>matrix(</w:t>
+      </w:r>
+      <w:proofErr w:type="gramEnd"/>
+      <w:r>
+        <w:rPr>
+          <w:sz w:val="21"/>
+        </w:rPr>
+        <w:t>) and classification_report() calls. This forces the functions to use all three class labels even when only one is present in y_true, producing zero-filled rows/columns for absent classes.</w:t>
       </w:r>
     </w:p>
     <w:p>
@@ -2042,7 +2253,21 @@
         <w:rPr>
           <w:sz w:val="21"/>
         </w:rPr>
-        <w:t>Changed the vegetation mask from cls == 1 to ~(cls == 2) — all non-ground returns are treated as vegetation regardless of specific code. This correctly identifies vegetation at all four sites.</w:t>
+        <w:t xml:space="preserve">Changed the vegetation mask from cls == 1 to </w:t>
+      </w:r>
+      <w:proofErr w:type="gramStart"/>
+      <w:r>
+        <w:rPr>
+          <w:sz w:val="21"/>
+        </w:rPr>
+        <w:t>~(</w:t>
+      </w:r>
+      <w:proofErr w:type="gramEnd"/>
+      <w:r>
+        <w:rPr>
+          <w:sz w:val="21"/>
+        </w:rPr>
+        <w:t>cls == 2) — all non-ground returns are treated as vegetation regardless of specific code. This correctly identifies vegetation at all four sites.</w:t>
       </w:r>
     </w:p>
     <w:p>
@@ -2093,8 +2318,13 @@
       <w:pPr>
         <w:pStyle w:val="Heading2"/>
       </w:pPr>
-      <w:r>
-        <w:t>6.2  What Did Not Work — and Why</w:t>
+      <w:proofErr w:type="gramStart"/>
+      <w:r>
+        <w:t>6.2  What</w:t>
+      </w:r>
+      <w:proofErr w:type="gramEnd"/>
+      <w:r>
+        <w:t xml:space="preserve"> Did Not Work — and Why</w:t>
       </w:r>
     </w:p>
     <w:p>
@@ -2182,8 +2412,13 @@
       <w:pPr>
         <w:pStyle w:val="Heading2"/>
       </w:pPr>
-      <w:r>
-        <w:t>6.3  What Worked — Key Decisions That Led to Better Results</w:t>
+      <w:proofErr w:type="gramStart"/>
+      <w:r>
+        <w:t>6.3  What</w:t>
+      </w:r>
+      <w:proofErr w:type="gramEnd"/>
+      <w:r>
+        <w:t xml:space="preserve"> Worked — Key Decisions That Led to Better Results</w:t>
       </w:r>
     </w:p>
     <w:p>
@@ -2275,8 +2510,13 @@
       <w:pPr>
         <w:pStyle w:val="Heading2"/>
       </w:pPr>
-      <w:r>
-        <w:t>7.1  Baseline Classification — Five Models, LOSO-CV</w:t>
+      <w:proofErr w:type="gramStart"/>
+      <w:r>
+        <w:t>7.1  Baseline</w:t>
+      </w:r>
+      <w:proofErr w:type="gramEnd"/>
+      <w:r>
+        <w:t xml:space="preserve"> Classification — Five Models, LOSO-CV</w:t>
       </w:r>
     </w:p>
     <w:p>
@@ -2915,8 +3155,13 @@
       <w:pPr>
         <w:pStyle w:val="Heading2"/>
       </w:pPr>
-      <w:r>
-        <w:t>7.2  Per-Site Breakdown (Random Forest)</w:t>
+      <w:proofErr w:type="gramStart"/>
+      <w:r>
+        <w:t>7.2  Per</w:t>
+      </w:r>
+      <w:proofErr w:type="gramEnd"/>
+      <w:r>
+        <w:t>-Site Breakdown (Random Forest)</w:t>
       </w:r>
     </w:p>
     <w:p>
@@ -3544,8 +3789,13 @@
       <w:pPr>
         <w:pStyle w:val="Heading2"/>
       </w:pPr>
-      <w:r>
-        <w:t>7.3  Confusion Matrix Analysis</w:t>
+      <w:proofErr w:type="gramStart"/>
+      <w:r>
+        <w:t>7.3  Confusion</w:t>
+      </w:r>
+      <w:proofErr w:type="gramEnd"/>
+      <w:r>
+        <w:t xml:space="preserve"> Matrix Analysis</w:t>
       </w:r>
     </w:p>
     <w:p>
@@ -3620,8 +3870,13 @@
       <w:pPr>
         <w:pStyle w:val="Heading2"/>
       </w:pPr>
-      <w:r>
-        <w:t>7.4  Ablation Study</w:t>
+      <w:proofErr w:type="gramStart"/>
+      <w:r>
+        <w:t>7.4  Ablation</w:t>
+      </w:r>
+      <w:proofErr w:type="gramEnd"/>
+      <w:r>
+        <w:t xml:space="preserve"> Study</w:t>
       </w:r>
     </w:p>
     <w:p>
@@ -4091,8 +4346,16 @@
               <w:rPr>
                 <w:sz w:val="19"/>
               </w:rPr>
-              <w:t>Structure alone is near-chance</w:t>
-            </w:r>
+              <w:t xml:space="preserve">Structure alone is </w:t>
+            </w:r>
+            <w:proofErr w:type="gramStart"/>
+            <w:r>
+              <w:rPr>
+                <w:sz w:val="19"/>
+              </w:rPr>
+              <w:t>near-chance</w:t>
+            </w:r>
+            <w:proofErr w:type="gramEnd"/>
           </w:p>
         </w:tc>
       </w:tr>
@@ -4436,8 +4699,13 @@
       <w:pPr>
         <w:pStyle w:val="Heading2"/>
       </w:pPr>
-      <w:r>
-        <w:t>7.5  Binary Classification Detail</w:t>
+      <w:proofErr w:type="gramStart"/>
+      <w:r>
+        <w:t>7.5  Binary</w:t>
+      </w:r>
+      <w:proofErr w:type="gramEnd"/>
+      <w:r>
+        <w:t xml:space="preserve"> Classification Detail</w:t>
       </w:r>
     </w:p>
     <w:p>
@@ -4915,8 +5183,13 @@
       <w:pPr>
         <w:pStyle w:val="Heading2"/>
       </w:pPr>
-      <w:r>
-        <w:t>7.6  ALS Structural Features</w:t>
+      <w:proofErr w:type="gramStart"/>
+      <w:r>
+        <w:t>7.6  ALS</w:t>
+      </w:r>
+      <w:proofErr w:type="gramEnd"/>
+      <w:r>
+        <w:t xml:space="preserve"> Structural Features</w:t>
       </w:r>
     </w:p>
     <w:p>
@@ -5245,15 +5518,38 @@
           <w:color w:val="505050"/>
           <w:sz w:val="19"/>
         </w:rPr>
-        <w:t>Table 7. ALS fusion ablation. The +4.1 pp gain for 3-class is real but moderate; no binary gain confirms spectral saturation for the easier problem.</w:t>
+        <w:t xml:space="preserve">Table 7. ALS fusion ablation. The </w:t>
+      </w:r>
+      <w:proofErr w:type="gramStart"/>
+      <w:r>
+        <w:rPr>
+          <w:i/>
+          <w:color w:val="505050"/>
+          <w:sz w:val="19"/>
+        </w:rPr>
+        <w:t>+4.1 pp</w:t>
+      </w:r>
+      <w:proofErr w:type="gramEnd"/>
+      <w:r>
+        <w:rPr>
+          <w:i/>
+          <w:color w:val="505050"/>
+          <w:sz w:val="19"/>
+        </w:rPr>
+        <w:t xml:space="preserve"> gain for 3-class is real but moderate; no binary gain confirms spectral saturation for the easier problem.</w:t>
       </w:r>
     </w:p>
     <w:p>
       <w:pPr>
         <w:pStyle w:val="Heading2"/>
       </w:pPr>
-      <w:r>
-        <w:t>7.7  Field Spectroscopy (BilyKriz Dataset)</w:t>
+      <w:proofErr w:type="gramStart"/>
+      <w:r>
+        <w:t>7.7  Field</w:t>
+      </w:r>
+      <w:proofErr w:type="gramEnd"/>
+      <w:r>
+        <w:t xml:space="preserve"> Spectroscopy (BilyKriz Dataset)</w:t>
       </w:r>
     </w:p>
     <w:p>
@@ -5277,7 +5573,15 @@
         <w:jc w:val="both"/>
       </w:pPr>
       <w:r>
-        <w:t>Results were substantially lower than airborne CASI (BA = 0.413 vs. 0.621), driven by the Bílý Kríž fold collapse (BA = 0.000). Järvselja fold BA = 0.639 is actually higher than the airborne result (0.583) — suggesting that at full 2151 bands the spectral resolution advantage compensates for smaller sample size when the test site has diverse types.</w:t>
+        <w:t xml:space="preserve">Results were substantially lower than airborne CASI (BA = 0.413 vs. 0.621), driven by the Bílý Kríž fold collapse (BA = 0.000). Järvselja fold BA = 0.639 is </w:t>
+      </w:r>
+      <w:proofErr w:type="gramStart"/>
+      <w:r>
+        <w:t>actually higher</w:t>
+      </w:r>
+      <w:proofErr w:type="gramEnd"/>
+      <w:r>
+        <w:t xml:space="preserve"> than the airborne result (0.583) — suggesting that at full 2151 bands the spectral resolution advantage compensates for smaller sample size when the test site has diverse types.</w:t>
       </w:r>
     </w:p>
     <w:p>
@@ -5352,7 +5656,15 @@
         <w:jc w:val="both"/>
       </w:pPr>
       <w:r>
-        <w:t>A Jeffreys-Matusita separability proxy (mu1−mu2)² / (sigma1²+sigma2²) per wavelength identified the top-10 most discriminative wavelengths as: 2317, 2318, 2319, 2320, 2321, 2454, 2490, 350, 353, 372 nm. The SWIR-2 cluster (2317–2490 nm) corresponds to cellulose and lignin absorption features known to differ between needle-leaved and broad-leaved species. Critically, this region is not covered by CASI (382–1052 nm) — yet CASI achieves BA = 0.932 for binary classification. This confirms that VIS-NIR canopy spectra contain sufficient discriminative information at stand scale; SWIR does not add further benefit.</w:t>
+        <w:t>A Jeffreys-Matusita separability proxy (mu1−mu</w:t>
+      </w:r>
+      <w:proofErr w:type="gramStart"/>
+      <w:r>
+        <w:t>2)²</w:t>
+      </w:r>
+      <w:proofErr w:type="gramEnd"/>
+      <w:r>
+        <w:t xml:space="preserve"> / (sigma1²+sigma2²) per wavelength identified the top-10 most discriminative wavelengths as: 2317, 2318, 2319, 2320, 2321, 2454, 2490, 350, 353, 372 nm. The SWIR-2 cluster (2317–2490 nm) corresponds to cellulose and lignin absorption features known to differ between needle-leaved and broad-leaved species. Critically, this region is not covered by CASI (382–1052 nm) — yet CASI achieves BA = 0.932 for binary classification. This confirms that VIS-NIR canopy spectra contain sufficient discriminative information at stand scale; SWIR does not add further benefit.</w:t>
       </w:r>
     </w:p>
     <w:p>
@@ -5548,7 +5860,25 @@
           <w:color w:val="505050"/>
           <w:sz w:val="19"/>
         </w:rPr>
-        <w:t>Figure 11 — Random Forest band importance across 40 valid CASI bands (382–1052 nm). Red bars highlight the top-20 most important bands. The NIR plateau region (760–895 nm) and red-edge (680–740 nm) are consistently important.</w:t>
+        <w:t xml:space="preserve">Figure 11 — Random Forest band importance across 40 valid CASI bands (382–1052 nm). Red bars highlight the </w:t>
+      </w:r>
+      <w:proofErr w:type="gramStart"/>
+      <w:r>
+        <w:rPr>
+          <w:i/>
+          <w:color w:val="505050"/>
+          <w:sz w:val="19"/>
+        </w:rPr>
+        <w:t>top-20</w:t>
+      </w:r>
+      <w:proofErr w:type="gramEnd"/>
+      <w:r>
+        <w:rPr>
+          <w:i/>
+          <w:color w:val="505050"/>
+          <w:sz w:val="19"/>
+        </w:rPr>
+        <w:t xml:space="preserve"> most important bands. The NIR plateau region (760–895 nm) and red-edge (680–740 nm) are consistently important.</w:t>
       </w:r>
     </w:p>
     <w:p>
@@ -5569,8 +5899,13 @@
       <w:pPr>
         <w:pStyle w:val="Heading2"/>
       </w:pPr>
-      <w:r>
-        <w:t>8.1  Binary vs. Three-Class: What the Gap Tells Us</w:t>
+      <w:proofErr w:type="gramStart"/>
+      <w:r>
+        <w:t>8.1  Binary</w:t>
+      </w:r>
+      <w:proofErr w:type="gramEnd"/>
+      <w:r>
+        <w:t xml:space="preserve"> vs. Three-Class: What the Gap Tells Us</w:t>
       </w:r>
     </w:p>
     <w:p>
@@ -5578,7 +5913,15 @@
         <w:jc w:val="both"/>
       </w:pPr>
       <w:r>
-        <w:t>The jump from BA = 0.621 (three-class) to BA = 0.932 (binary) is the most informative single number in this study. It tells us that the failure mode is not the biome-generalisation problem — the spectral signal for conifer vs. broadleaf is robust and consistent across Finland, Estonia, and Czech Republic. The failure is the mixed label. Stand-level mean spectra average over the spatial mosaic of different tree crowns, producing a feature vector that is a weighted sum of the pure class spectra. A stand with 60% spruce and 40% birch produces a mean spectrum that is geometrically closer to pure spruce than to pure birch — because spruce needles have lower reflectance and absorb more light, biasing the stand average toward the darker class. As a result, the classifier consistently places mixed stands in the coniferous region of feature space.</w:t>
+        <w:t xml:space="preserve">The jump from BA = 0.621 (three-class) to BA = 0.932 (binary) is the most informative single number in this study. It tells us that the failure mode is not the biome-generalisation problem — the spectral signal for conifer vs. broadleaf is robust and consistent across Finland, Estonia, and Czech Republic. The failure is the mixed label. Stand-level mean spectra average over the spatial mosaic of different tree crowns, producing a feature vector that is a weighted sum of the pure class spectra. A stand with 60% spruce and 40% </w:t>
+      </w:r>
+      <w:proofErr w:type="gramStart"/>
+      <w:r>
+        <w:t>birch</w:t>
+      </w:r>
+      <w:proofErr w:type="gramEnd"/>
+      <w:r>
+        <w:t xml:space="preserve"> produces a mean spectrum that is geometrically closer to pure spruce than to pure birch — because spruce needles have lower reflectance and absorb more light, biasing the stand average toward the darker class. As a result, the classifier consistently places mixed stands in the coniferous region of feature space.</w:t>
       </w:r>
     </w:p>
     <w:p>
@@ -5593,8 +5936,13 @@
       <w:pPr>
         <w:pStyle w:val="Heading2"/>
       </w:pPr>
-      <w:r>
-        <w:t>8.2  Site Composition as a Confound in LOSO Evaluation</w:t>
+      <w:proofErr w:type="gramStart"/>
+      <w:r>
+        <w:t>8.2  Site</w:t>
+      </w:r>
+      <w:proofErr w:type="gramEnd"/>
+      <w:r>
+        <w:t xml:space="preserve"> Composition as a Confound in LOSO Evaluation</w:t>
       </w:r>
     </w:p>
     <w:p>
@@ -5617,8 +5965,13 @@
       <w:pPr>
         <w:pStyle w:val="Heading2"/>
       </w:pPr>
-      <w:r>
-        <w:t>8.3  Why ALS Helps 3-class but Not Binary</w:t>
+      <w:proofErr w:type="gramStart"/>
+      <w:r>
+        <w:t>8.3  Why</w:t>
+      </w:r>
+      <w:proofErr w:type="gramEnd"/>
+      <w:r>
+        <w:t xml:space="preserve"> ALS Helps 3-class but Not Binary</w:t>
       </w:r>
     </w:p>
     <w:p>
@@ -5633,9 +5986,14 @@
       <w:pPr>
         <w:pStyle w:val="Heading2"/>
       </w:pPr>
+      <w:proofErr w:type="gramStart"/>
       <w:r>
         <w:lastRenderedPageBreak/>
-        <w:t>8.4  Field Spectra vs. Airborne: Sensor Modality Matters</w:t>
+        <w:t>8.4  Field</w:t>
+      </w:r>
+      <w:proofErr w:type="gramEnd"/>
+      <w:r>
+        <w:t xml:space="preserve"> Spectra vs. Airborne: Sensor Modality Matters</w:t>
       </w:r>
     </w:p>
     <w:p>
@@ -5658,9 +6016,11 @@
       <w:pPr>
         <w:pStyle w:val="Heading2"/>
       </w:pPr>
+      <w:proofErr w:type="gramStart"/>
       <w:r>
         <w:t>8.5  Limitations</w:t>
       </w:r>
+      <w:proofErr w:type="gramEnd"/>
     </w:p>
     <w:p>
       <w:pPr>
@@ -5770,7 +6130,15 @@
         <w:jc w:val="both"/>
       </w:pPr>
       <w:r>
-        <w:t>Torabzadeh et al. (2019, Agricultural and Forest Meteorology 279: 107666) fused hyperspectral and ALS features for tree species mapping in a temperate mixed forest and reported 5–15% improvements from ALS crown features. Our +4.1 pp gain for 3-class classification is comparable, noting that their regime (within-site, species level) is easier than ours (cross-site, type level). Their study was single-site; our cross-site design is a harder and more realistic evaluation.</w:t>
+        <w:t xml:space="preserve">Torabzadeh et al. (2019, Agricultural and Forest Meteorology 279: 107666) fused hyperspectral and ALS features for tree species mapping in a temperate mixed forest and reported 5–15% improvements from ALS crown features. Our </w:t>
+      </w:r>
+      <w:proofErr w:type="gramStart"/>
+      <w:r>
+        <w:t>+4.1 pp</w:t>
+      </w:r>
+      <w:proofErr w:type="gramEnd"/>
+      <w:r>
+        <w:t xml:space="preserve"> gain for 3-class classification is comparable, noting that their regime (within-site, species level) is easier than ours (cross-site, type level). Their study was single-site; our cross-site design is a harder and more realistic evaluation.</w:t>
       </w:r>
     </w:p>
     <w:p>
@@ -5800,7 +6168,15 @@
         <w:jc w:val="both"/>
       </w:pPr>
       <w:r>
-        <w:t>This project set out to answer whether airborne hyperspectral reflectance can generalise across European biomes for forest-type classification. The answer is: yes for the binary conifer/broadleaf problem (BA = 0.932), and partially for the three-class problem (BA = 0.621, limited by the unresolvable mixed class).</w:t>
+        <w:t xml:space="preserve">This project set out to answer whether airborne hyperspectral reflectance can generalise across European biomes for forest-type classification. The answer is: </w:t>
+      </w:r>
+      <w:proofErr w:type="gramStart"/>
+      <w:r>
+        <w:t>yes</w:t>
+      </w:r>
+      <w:proofErr w:type="gramEnd"/>
+      <w:r>
+        <w:t xml:space="preserve"> for the binary conifer/broadleaf problem (BA = 0.932), and partially for the three-class problem (BA = 0.621, limited by the unresolvable mixed class).</w:t>
       </w:r>
     </w:p>
     <w:p>
@@ -5881,7 +6257,21 @@
         <w:rPr>
           <w:sz w:val="21"/>
         </w:rPr>
-        <w:t>Patch-level or crown-level feature extraction (15×15 pixel windows or ALS-segmented crowns) to replace stand-level means for the mixed class.</w:t>
+        <w:t>Patch-level or crown-level feature extraction (15×</w:t>
+      </w:r>
+      <w:proofErr w:type="gramStart"/>
+      <w:r>
+        <w:rPr>
+          <w:sz w:val="21"/>
+        </w:rPr>
+        <w:t>15 pixel</w:t>
+      </w:r>
+      <w:proofErr w:type="gramEnd"/>
+      <w:r>
+        <w:rPr>
+          <w:sz w:val="21"/>
+        </w:rPr>
+        <w:t xml:space="preserve"> windows or ALS-segmented crowns) to replace stand-level means for the mixed class.</w:t>
       </w:r>
     </w:p>
     <w:p>
@@ -6456,7 +6846,21 @@
               <w:rPr>
                 <w:sz w:val="19"/>
               </w:rPr>
-              <w:t>als_features.csv; als_fusion.json; Table 7</w:t>
+              <w:t>als_features.csv; als_</w:t>
+            </w:r>
+            <w:proofErr w:type="gramStart"/>
+            <w:r>
+              <w:rPr>
+                <w:sz w:val="19"/>
+              </w:rPr>
+              <w:t>fusion.json</w:t>
+            </w:r>
+            <w:proofErr w:type="gramEnd"/>
+            <w:r>
+              <w:rPr>
+                <w:sz w:val="19"/>
+              </w:rPr>
+              <w:t>; Table 7</w:t>
             </w:r>
           </w:p>
         </w:tc>
@@ -6526,7 +6930,21 @@
               <w:rPr>
                 <w:sz w:val="19"/>
               </w:rPr>
-              <w:t>field_spectra_deep.json; cross_sensor_bk.json; Figures 5,8,10</w:t>
+              <w:t>field_spectra_</w:t>
+            </w:r>
+            <w:proofErr w:type="gramStart"/>
+            <w:r>
+              <w:rPr>
+                <w:sz w:val="19"/>
+              </w:rPr>
+              <w:t>deep.json</w:t>
+            </w:r>
+            <w:proofErr w:type="gramEnd"/>
+            <w:r>
+              <w:rPr>
+                <w:sz w:val="19"/>
+              </w:rPr>
+              <w:t>; cross_sensor_bk.json; Figures 5,8,10</w:t>
             </w:r>
           </w:p>
         </w:tc>
@@ -6707,7 +7125,21 @@
         <w:rPr>
           <w:sz w:val="21"/>
         </w:rPr>
-        <w:t>5.  Richter, R., Reu, B., Wirth, C., Doktor, D., &amp; Vohland, M. (2016). The use of airborne hyperspectral data for tree species classification in a species-rich Central European forest area. International Journal of Applied Earth Observation and Geoinformation, 52, 464–474.</w:t>
+        <w:t xml:space="preserve">5.  Richter, R., Reu, B., Wirth, C., Doktor, D., &amp; Vohland, M. (2016). The use of airborne hyperspectral data for tree species classification in a species-rich </w:t>
+      </w:r>
+      <w:proofErr w:type="gramStart"/>
+      <w:r>
+        <w:rPr>
+          <w:sz w:val="21"/>
+        </w:rPr>
+        <w:t>Central European forest</w:t>
+      </w:r>
+      <w:proofErr w:type="gramEnd"/>
+      <w:r>
+        <w:rPr>
+          <w:sz w:val="21"/>
+        </w:rPr>
+        <w:t xml:space="preserve"> area. International Journal of Applied Earth Observation and Geoinformation, 52, 464–474.</w:t>
       </w:r>
     </w:p>
     <w:p>
@@ -6780,11 +7212,14 @@
       <w:pPr>
         <w:jc w:val="both"/>
       </w:pPr>
-    </w:p>
-    <w:p>
-      <w:pPr>
-        <w:jc w:val="both"/>
-      </w:pPr>
+      <w:hyperlink r:id="rId17" w:history="1">
+        <w:r>
+          <w:rPr>
+            <w:rStyle w:val="Hyperlink"/>
+          </w:rPr>
+          <w:t>https://github.com/MajorMask/multi-disciplinary_Hyperspectral/tree/model</w:t>
+        </w:r>
+      </w:hyperlink>
     </w:p>
     <w:p>
       <w:pPr>
@@ -7406,7 +7841,23 @@
           <w:sz w:val="18"/>
         </w:rPr>
         <w:br/>
-        <w:t>python -m src.experiments.runner --config config/default.yaml</w:t>
+        <w:t xml:space="preserve">python -m </w:t>
+      </w:r>
+      <w:proofErr w:type="gramStart"/>
+      <w:r>
+        <w:rPr>
+          <w:rFonts w:ascii="Courier New" w:hAnsi="Courier New"/>
+          <w:sz w:val="18"/>
+        </w:rPr>
+        <w:t>src.experiments</w:t>
+      </w:r>
+      <w:proofErr w:type="gramEnd"/>
+      <w:r>
+        <w:rPr>
+          <w:rFonts w:ascii="Courier New" w:hAnsi="Courier New"/>
+          <w:sz w:val="18"/>
+        </w:rPr>
+        <w:t>.runner --config config/default.yaml</w:t>
       </w:r>
       <w:r>
         <w:rPr>
@@ -7550,20 +8001,55 @@
         <w:pStyle w:val="Heading1"/>
       </w:pPr>
       <w:r>
-        <w:t xml:space="preserve">Appendix </w:t>
-      </w:r>
-      <w:r>
-        <w:t>B</w:t>
-      </w:r>
-      <w:r>
-        <w:t xml:space="preserve"> — Software Environment and Reproducibility</w:t>
-      </w:r>
-    </w:p>
-    <w:p>
-      <w:pPr>
-        <w:jc w:val="both"/>
-      </w:pPr>
-    </w:p>
+        <w:lastRenderedPageBreak/>
+        <w:t xml:space="preserve">Appendix B — </w:t>
+      </w:r>
+      <w:r>
+        <w:t>Usage of AI Tools</w:t>
+      </w:r>
+    </w:p>
+    <w:p>
+      <w:r>
+        <w:t>I use</w:t>
+      </w:r>
+      <w:r>
+        <w:t>d</w:t>
+      </w:r>
+      <w:r>
+        <w:t xml:space="preserve"> perplexity for preliminary research and to learn the techniques of processing HDR, BSQ and TIFF. A lot of the motivation for the experiments was suggested by the aggregation of methods with the usage of AI </w:t>
+      </w:r>
+      <w:proofErr w:type="spellStart"/>
+      <w:r>
+        <w:t>a.k.a</w:t>
+      </w:r>
+      <w:proofErr w:type="spellEnd"/>
+      <w:r>
+        <w:t xml:space="preserve"> perplexity. The methods suggested by the report was visibly wrong and the report I expected it to make was not really of any use. The work above is my own and the process has been completely documented. There </w:t>
+      </w:r>
+      <w:proofErr w:type="gramStart"/>
+      <w:r>
+        <w:t>has</w:t>
+      </w:r>
+      <w:proofErr w:type="gramEnd"/>
+      <w:r>
+        <w:t xml:space="preserve"> been multiple times where I saw there could be some enhancement done to fast-track the process </w:t>
+      </w:r>
+      <w:r>
+        <w:t>for troubleshooting the code and documentation of results hence I used some tools which use Generative technologies for information retrieval. Hence, I provide a disclosure and give a glimpse of the chat I used initially to narrow down the things not to do with the process of elimination (because AI was wrong about most of the report and the approach) so I didn’t outsource my work to it.</w:t>
+      </w:r>
+    </w:p>
+    <w:p>
+      <w:hyperlink r:id="rId18" w:history="1">
+        <w:r>
+          <w:rPr>
+            <w:rStyle w:val="Hyperlink"/>
+          </w:rPr>
+          <w:t>https://www.perplexity.ai/search/afd78cf2-70b5-469a-bb64-83e00e8ccfc7</w:t>
+        </w:r>
+      </w:hyperlink>
+    </w:p>
+    <w:p/>
+    <w:p/>
     <w:sectPr>
       <w:pgSz w:w="12240" w:h="15840"/>
       <w:pgMar w:top="1417" w:right="1587" w:bottom="1417" w:left="1587" w:header="720" w:footer="720" w:gutter="0"/>
@@ -19154,6 +19640,29 @@
       </w:tcPr>
     </w:tblStylePr>
   </w:style>
+  <w:style w:type="character" w:styleId="Hyperlink">
+    <w:name w:val="Hyperlink"/>
+    <w:basedOn w:val="DefaultParagraphFont"/>
+    <w:uiPriority w:val="99"/>
+    <w:unhideWhenUsed/>
+    <w:rsid w:val="00FA7B81"/>
+    <w:rPr>
+      <w:color w:val="0000FF" w:themeColor="hyperlink"/>
+      <w:u w:val="single"/>
+    </w:rPr>
+  </w:style>
+  <w:style w:type="character" w:styleId="UnresolvedMention">
+    <w:name w:val="Unresolved Mention"/>
+    <w:basedOn w:val="DefaultParagraphFont"/>
+    <w:uiPriority w:val="99"/>
+    <w:semiHidden/>
+    <w:unhideWhenUsed/>
+    <w:rsid w:val="00FA7B81"/>
+    <w:rPr>
+      <w:color w:val="605E5C"/>
+      <w:shd w:val="clear" w:color="auto" w:fill="E1DFDD"/>
+    </w:rPr>
+  </w:style>
 </w:styles>
 </file>
 

</xml_diff>